<commit_message>
v1.1.0: lateral tracking, sensor-health awareness, capability zones, unseen soils, equal-coverage clearance, value of information, cost of ownership
Adds SubSurface_v4.py (13 self-tests), figure_generation_v4.py, results_v4/, supplement, revised manuscript. Withdraws the v1.0 clearance comparison that confounded the three-state rule with its operating point.

Co-Authored-By: Claude Sonnet 5.5 <noreply@anthropic.com>
</commit_message>
<xml_diff>
--- a/manuscript/Cover_Letter_TUST.docx
+++ b/manuscript/Cover_Letter_TUST.docx
@@ -100,7 +100,7 @@
         <w:spacing w:after="60"/>
       </w:pPr>
       <w:r>
-        <w:t>Ground-penetrating radar (GPR) and electromagnetic locators report detections, but a missing detection is weak evidence where soil attenuates the signal, and a map that marks only what was detected invites the reader to treat silence as clearance. The paper specifies a decision layer above the sensors: an anchored Bayesian filter along the corridor, likelihoods that depend on soil, material and depth, and a three-state output (present, absent, unverified) with a verification-priority ranking for trial pits. It then tests the layer in a seeded Monte Carlo study, with the following design choices that I believe respond to what a reader of this journal would ask:</w:t>
+        <w:t>Ground-penetrating radar (GPR) and electromagnetic locators report detections, but a missing detection is weak evidence where soil attenuates the signal or an instrument has failed, and a map that marks only what was detected invites the reader to treat silence as clearance. The paper specifies a decision layer above the sensors: a Bayesian filter that follows a utility along a corridor and across a lateral grid, likelihoods that depend on soil, material and depth, sensor-health awareness, depth-resolved capability zones, and a three-state output (present, absent, unverified) with a value-of-information ranking for trial pits. It tests the layer in seeded Monte Carlo experiments designed so that a reader can see where it helps and where it does not:</w:t>
       </w:r>
     </w:p>
     <w:p>
@@ -109,7 +109,7 @@
         <w:spacing w:after="60"/>
       </w:pPr>
       <w:r>
-        <w:t>Detection and classification, probability calibration, location and depth accuracy, and the share of the network left unverified are reported separately, each with explicit denominators (sensor-visible cells, all cells, sensor-blind cells).</w:t>
+        <w:t>Detection and classification, probability calibration, lateral and depth accuracy, and the share of the network left unverified are reported separately, with explicit denominators and cluster-bootstrap 95% intervals.</w:t>
       </w:r>
     </w:p>
     <w:p>
@@ -118,7 +118,7 @@
         <w:spacing w:after="60"/>
       </w:pPr>
       <w:r>
-        <w:t>Fifteen baselines and ablations are compared on identical simulated data, including an EM-only proxy for current practice, rule-based and per-segment fusion, propagation without an anchor, generic soil likelihoods and three diagnostic variants.</w:t>
+        <w:t>Six models are compared on identical simulated data in sixteen scenarios, including an equal-effort baseline (three repeat passes on the centre line), lateral displacement of utilities, sensor failure with an imperfect diagnostic, a wrong or missing anchor, an offset map, sparse coverage, and two soils not used to set the model.</w:t>
       </w:r>
     </w:p>
     <w:p>
@@ -127,16 +127,7 @@
         <w:spacing w:after="60"/>
       </w:pPr>
       <w:r>
-        <w:t>Stress tests cover lateral displacement of utilities, an anchor that is certain but wrong, a dead sensor, dropped observations, a mis-specified hazard, correlated evidence and ten one-at-a-time parameter changes.</w:t>
-      </w:r>
-    </w:p>
-    <w:p>
-      <w:pPr>
-        <w:pStyle w:val="ListBullet"/>
-        <w:spacing w:after="60"/>
-      </w:pPr>
-      <w:r>
-        <w:t>A decision-consequence experiment compares excavation-clearance policies by strikes per kilometre and corridor released, and trial-pit allocation rules.</w:t>
+        <w:t>The excavation-clearance comparison is made at equal released coverage, equal risk and equal cost, and trial-pit allocation by value of information is compared with random and probability-first allocation.</w:t>
       </w:r>
     </w:p>
     <w:p>
@@ -155,7 +146,7 @@
         <w:spacing w:after="120"/>
       </w:pPr>
       <w:r>
-        <w:t>In sensor-visible cells the framework reaches 98.3% accuracy (miss rate 2.4%, false-alarm rate 0.3%), a modest improvement over calibrated per-segment fusion (97.8%) and far above the EM-only proxy (53.5%). 16% of the assumed network is sensor-blind and is reported as unverified. In a simulated clearance trial the three-state rule gives about 4.5 times fewer strikes per kilometre than a binary map, for 7 percentage points less corridor released. The paper also reports where the framework fails: lateral shifts, an incorrectly certain anchor, GPR failure and uncertain depth. Several results are unflattering to the proposal, for example that the anchor adds little in sensor-visible cells and that EM adds little in aggregate, and they are reported as found.</w:t>
+        <w:t>In sensor-visible cells the anchored filter reaches 98.3% accuracy (miss rate 2.4%, false-alarm rate 0.3%), a modest improvement over calibrated per-segment fusion (97.8%) and far above an EM-only proxy (53.5%); 16% of the assumed network is sensor-blind and is reported as unverified. With three parallel passes, lateral tracking keeps false alarms near 2.3% when lateral shifts are frequent, where one-pass filters reach 6.7%. Sensor-health awareness reduces false clearance from 19% to 4% under mixed sensor health, but an unflagged GPR failure defeats every model tested, and in soils not used to set the model false clearance is still 9% with an on-site reference check. Several results are unflattering to the proposal and are reported as found: the anchor adds little in sensor-visible cells, EM adds little in aggregate, and at equal released coverage the layer is only slightly safer than per-segment fusion.</w:t>
       </w:r>
     </w:p>
     <w:p>
@@ -174,7 +165,7 @@
         <w:spacing w:after="120"/>
       </w:pPr>
       <w:r>
-        <w:t>The simulation tests the logic of the decision layer and its sensitivity to its own assumptions. Its parameters are assumptions, not measurements, and the manuscript has a section that separates what is demonstrated within the model, what is suggested conditionally on the model resembling reality, and what is not established. I do not claim field performance. I would welcome the Editors’ and reviewers’ views on whether a simulation-based article of this kind, which fixes definitions and a protocol for a field trial, is appropriate for the journal.</w:t>
+        <w:t>The simulation tests the logic of the decision layer and its sensitivity to its own assumptions. Its parameters are assumptions, not measurements, and the manuscript separates what is demonstrated within the model, what is suggested conditionally on the model resembling reality, and what is not established. I do not claim field performance. I would welcome the Editors’ and reviewers’ views on whether a simulation-based article of this kind, which fixes definitions and a protocol for a field trial, is appropriate for the journal.</w:t>
       </w:r>
     </w:p>
     <w:p>
@@ -185,7 +176,7 @@
         <w:rPr>
           <w:b/>
         </w:rPr>
-        <w:t>Prior dissemination and disclosures</w:t>
+        <w:t>Correction to an earlier preprint and prior dissemination</w:t>
       </w:r>
     </w:p>
     <w:p>
@@ -193,7 +184,7 @@
         <w:spacing w:after="120"/>
       </w:pPr>
       <w:r>
-        <w:t>An earlier, non-peer-reviewed white paper describing the concept was prepared in response to an open innovation challenge on detecting underground utilities issued through the Wazoku (InnoCentive) platform. It is not a publication. The numerical results of that white paper came from an earlier version of the simulation whose code was not available when this manuscript was prepared; the simulation was reimplemented from the method description, all numbers in the manuscript come from the released code, and they differ from those of the white paper. The manuscript is not under consideration elsewhere. I am the sole author, have no competing interests and received no funding.</w:t>
+        <w:t>Version 1 of the preprint (https://doi.org/10.5281/zenodo.23306883) reported that a three-state rule gave about four times fewer simulated strikes than a binary map. That comparison confounded the rule with the operating point (the two policies released different shares of the corridor). The enclosed manuscript, which is version 2 of the preprint, compares policies at equal coverage and withdraws the claim. An earlier, non-peer-reviewed white paper describing the concept was prepared in response to an open innovation challenge on detecting underground utilities issued through the Wazoku (InnoCentive) platform; it is not a publication, and its numerical results came from an earlier version of the simulation whose code was not available when this manuscript was prepared, so the simulation was reimplemented from the method description. The manuscript is not under consideration elsewhere. I am the sole author, have no competing interests and received no funding.</w:t>
       </w:r>
     </w:p>
     <w:p>
@@ -212,7 +203,7 @@
         <w:spacing w:after="120"/>
       </w:pPr>
       <w:r>
-        <w:t>All code, tests, the configuration, results.json and figure scripts are public at https://github.com/sandlerleon/subsurface-risk-calibrated-mapping (release v1.0.0) and archived at https://doi.org/10.5281/zenodo.23306881; a preprint of the manuscript is available at https://doi.org/10.5281/zenodo.23306883. Every table and figure is regenerated by the commands in Appendix B of the manuscript. The manuscript declares, in line with the publisher’s policy, that Claude (Anthropic; Claude Sonnet 5.5, through Claude Code) was used to help write and run the code, generate figures and draft and edit the text, that the simulation outputs were produced by running the released code with a fixed seed, and that I take full responsibility for the content.</w:t>
+        <w:t>All code, tests, configurations, results files and figure scripts are public at https://github.com/sandlerleon/subsurface-risk-calibrated-mapping (release v1.1.0) and archived at https://doi.org/10.5281/zenodo.23307525; a preprint is available at https://doi.org/10.5281/zenodo.23307526. Every table and figure is regenerated by the commands in Appendix B of the manuscript, and a Supplementary Material file gives the full scenario tables. The manuscript declares, in line with the publisher’s policy, that Claude (Anthropic; Claude Sonnet 5.5, through Claude Code) was used to help write and run the code, generate figures and draft and edit the text, that the simulation outputs were produced by running the released code with a fixed seed, and that I take full responsibility for the content.</w:t>
       </w:r>
     </w:p>
     <w:p>

</xml_diff>

<commit_message>
v1.2.0: reviewer revision - structural mismatch, parameter envelope, plausibility check, modelled intersections, figure set
Co-Authored-By: Claude Sonnet 5.5 <noreply@anthropic.com>
</commit_message>
<xml_diff>
--- a/manuscript/Cover_Letter_TUST.docx
+++ b/manuscript/Cover_Letter_TUST.docx
@@ -81,64 +81,13 @@
         <w:spacing w:after="120"/>
       </w:pPr>
       <w:r>
-        <w:t>I submit the enclosed article for consideration in Tunnelling and Underground Space Technology. It concerns the mapping of buried utilities before excavation in the urban underground, a subject the journal has addressed in its reviews of utility mapping and location accuracy (Metje et al., 2007; Costello et al., 2007; Hao et al., 2012; Jaw and Hashim, 2013; Xie et al., 2022). The paper is a simulation study. It uses no field data and says so throughout.</w:t>
-      </w:r>
-    </w:p>
-    <w:p>
-      <w:pPr>
-        <w:spacing w:after="60"/>
-      </w:pPr>
-      <w:r>
         <w:rPr>
           <w:b/>
         </w:rPr>
-        <w:t>What the paper does</w:t>
+        <w:t>Relevance to underground engineering.</w:t>
       </w:r>
-    </w:p>
-    <w:p>
-      <w:pPr>
-        <w:spacing w:after="60"/>
-      </w:pPr>
       <w:r>
-        <w:t>Ground-penetrating radar (GPR) and electromagnetic locators report detections, but a missing detection is weak evidence where soil attenuates the signal or an instrument has failed, and a map that marks only what was detected invites the reader to treat silence as clearance. The paper specifies a decision layer above the sensors: a Bayesian filter that follows a utility along a corridor and across a lateral grid, likelihoods that depend on soil, material and depth, sensor-health awareness, depth-resolved capability zones, and a three-state output (present, absent, unverified) with a value-of-information ranking for trial pits. It tests the layer in seeded Monte Carlo experiments designed so that a reader can see where it helps and where it does not:</w:t>
-      </w:r>
-    </w:p>
-    <w:p>
-      <w:pPr>
-        <w:pStyle w:val="ListBullet"/>
-        <w:spacing w:after="60"/>
-      </w:pPr>
-      <w:r>
-        <w:t>Detection and classification, probability calibration, lateral and depth accuracy, and the share of the network left unverified are reported separately, with explicit denominators and cluster-bootstrap 95% intervals.</w:t>
-      </w:r>
-    </w:p>
-    <w:p>
-      <w:pPr>
-        <w:pStyle w:val="ListBullet"/>
-        <w:spacing w:after="60"/>
-      </w:pPr>
-      <w:r>
-        <w:t>Six models are compared on identical simulated data in sixteen scenarios, including an equal-effort baseline (three repeat passes on the centre line), lateral displacement of utilities, sensor failure with an imperfect diagnostic, a wrong or missing anchor, an offset map, sparse coverage, and two soils not used to set the model.</w:t>
-      </w:r>
-    </w:p>
-    <w:p>
-      <w:pPr>
-        <w:pStyle w:val="ListBullet"/>
-        <w:spacing w:after="60"/>
-      </w:pPr>
-      <w:r>
-        <w:t>The excavation-clearance comparison is made at equal released coverage, equal risk and equal cost, and trial-pit allocation by value of information is compared with random and probability-first allocation.</w:t>
-      </w:r>
-    </w:p>
-    <w:p>
-      <w:pPr>
-        <w:spacing w:after="60"/>
-      </w:pPr>
-      <w:r>
-        <w:rPr>
-          <w:b/>
-        </w:rPr>
-        <w:t>Principal results (all within the model)</w:t>
+        <w:t xml:space="preserve"> Excavation in the urban underground starts from utility maps whose reliability is rarely stated, and a map that marks only what was detected invites the reader to treat silence as clearance, where the ground, the depth or a failed instrument may have made detection impossible. The journal has addressed utility mapping and location accuracy in its reviews (Metje et al., 2007; Costello et al., 2007; Hao et al., 2012; Jaw and Hashim, 2013; Xie et al., 2022). The enclosed paper concerns how a survey should represent the limits of its own evidence.</w:t>
       </w:r>
     </w:p>
     <w:p>
@@ -146,18 +95,13 @@
         <w:spacing w:after="120"/>
       </w:pPr>
       <w:r>
-        <w:t>In sensor-visible cells the anchored filter reaches 98.3% accuracy (miss rate 2.4%, false-alarm rate 0.3%), a modest improvement over calibrated per-segment fusion (97.8%) and far above an EM-only proxy (53.5%); 16% of the assumed network is sensor-blind and is reported as unverified. With three parallel passes, lateral tracking keeps false alarms near 2.3% when lateral shifts are frequent, where one-pass filters reach 6.7%. Sensor-health awareness reduces false clearance from 19% to 4% under mixed sensor health, but an unflagged GPR failure defeats every model tested, and in soils not used to set the model false clearance is still 9% with an on-site reference check. Several results are unflattering to the proposal and are reported as found: the anchor adds little in sensor-visible cells, EM adds little in aggregate, and at equal released coverage the layer is only slightly safer than per-segment fusion.</w:t>
-      </w:r>
-    </w:p>
-    <w:p>
-      <w:pPr>
-        <w:spacing w:after="60"/>
-      </w:pPr>
-      <w:r>
         <w:rPr>
           <w:b/>
         </w:rPr>
-        <w:t>Scope and limits</w:t>
+        <w:t>Methodological contribution.</w:t>
+      </w:r>
+      <w:r>
+        <w:t xml:space="preserve"> The paper specifies and evaluates a risk-calibrated decision policy for subsurface utility surveys, built from known ingredients (spatial tracking, sensor fusion, reject-option decisions, calibration): a filter that follows a utility along and across a corridor, treats a sensor flagged as failed as uninformative, derives an explicit “unverified” state from the capability of the instruments at the estimated depth, and ranks verification by value of information. The contribution claimed is the integration and the evaluation, not a new filtering algorithm; the manuscript compares the policy with the closest existing approaches (Table 1), keeps detection, calibration, lateral localisation and unverified coverage apart, and compares policies at equal survey effort and equal released coverage.</w:t>
       </w:r>
     </w:p>
     <w:p>
@@ -165,18 +109,13 @@
         <w:spacing w:after="120"/>
       </w:pPr>
       <w:r>
-        <w:t>The simulation tests the logic of the decision layer and its sensitivity to its own assumptions. Its parameters are assumptions, not measurements, and the manuscript separates what is demonstrated within the model, what is suggested conditionally on the model resembling reality, and what is not established. I do not claim field performance. I would welcome the Editors’ and reviewers’ views on whether a simulation-based article of this kind, which fixes definitions and a protocol for a field trial, is appropriate for the journal.</w:t>
-      </w:r>
-    </w:p>
-    <w:p>
-      <w:pPr>
-        <w:spacing w:after="60"/>
-      </w:pPr>
-      <w:r>
         <w:rPr>
           <w:b/>
         </w:rPr>
-        <w:t>Correction to an earlier preprint and prior dissemination</w:t>
+        <w:t>Why the findings merit review although the study is a simulation.</w:t>
+      </w:r>
+      <w:r>
+        <w:t xml:space="preserve"> The paper is a methodological demonstration and says so: sensor behaviour is assumed, and no published detection-versus-depth dataset was reproduced (Section 4.10). Its value is that it shows where the policy helps and where it does not, with intervals and stress tests that include a structurally different truth. With three parallel passes, lateral tracking holds false alarms near 2.3% under frequent lateral shifts where one-pass filters reach 6.7%, and sensor-health awareness cuts false clearance from 19% to 4% under mixed sensor health; but an unflagged sensor failure defeats every model, a parallel utility turns the lateral tracker’s advantage into a disadvantage (false clearance 15% against 2%), unseen soils leave 9% false clearance with an on-site check, and at equal released coverage the gain over per-segment fusion is small. These unflattering results are reported as found. Simulated utility intersections are used as a risk proxy, not as evidence of real strike rates. I would welcome the Editors’ view on whether a simulation-based article of this kind, which fixes definitions and a protocol for a field trial, is appropriate for the journal.</w:t>
       </w:r>
     </w:p>
     <w:p>
@@ -184,18 +123,13 @@
         <w:spacing w:after="120"/>
       </w:pPr>
       <w:r>
-        <w:t>Version 1 of the preprint (https://doi.org/10.5281/zenodo.23306883) reported that a three-state rule gave about four times fewer simulated strikes than a binary map. That comparison confounded the rule with the operating point (the two policies released different shares of the corridor). The enclosed manuscript, which is version 2 of the preprint, compares policies at equal coverage and withdraws the claim. An earlier, non-peer-reviewed white paper describing the concept was prepared in response to an open innovation challenge on detecting underground utilities issued through the Wazoku (InnoCentive) platform; it is not a publication, and its numerical results came from an earlier version of the simulation whose code was not available when this manuscript was prepared, so the simulation was reimplemented from the method description. The manuscript is not under consideration elsewhere. I am the sole author, have no competing interests and received no funding.</w:t>
-      </w:r>
-    </w:p>
-    <w:p>
-      <w:pPr>
-        <w:spacing w:after="60"/>
-      </w:pPr>
-      <w:r>
         <w:rPr>
           <w:b/>
         </w:rPr>
-        <w:t>Data, code and AI use</w:t>
+        <w:t>Prior dissemination and corrections.</w:t>
+      </w:r>
+      <w:r>
+        <w:t xml:space="preserve"> Version 1 of the preprint (https://doi.org/10.5281/zenodo.23306883) reported a four-fold advantage of a three-state rule that came from comparing different released coverages; it is withdrawn and the manuscript compares policies at equal coverage. An earlier non-peer-reviewed white paper for an open innovation challenge (Wazoku/InnoCentive) described the concept; it is not a publication, and its numbers came from simulation code that was not available when this manuscript was prepared, so the simulation was reimplemented. The manuscript is not under consideration elsewhere. I am the sole author, have no competing interests and received no funding.</w:t>
       </w:r>
     </w:p>
     <w:p>
@@ -203,7 +137,13 @@
         <w:spacing w:after="120"/>
       </w:pPr>
       <w:r>
-        <w:t>All code, tests, configurations, results files and figure scripts are public at https://github.com/sandlerleon/subsurface-risk-calibrated-mapping (release v1.1.0) and archived at https://doi.org/10.5281/zenodo.23307525; a preprint is available at https://doi.org/10.5281/zenodo.23307526. Every table and figure is regenerated by the commands in Appendix B of the manuscript, and a Supplementary Material file gives the full scenario tables. The manuscript declares, in line with the publisher’s policy, that Claude (Anthropic; Claude Sonnet 5.5, through Claude Code) was used to help write and run the code, generate figures and draft and edit the text, that the simulation outputs were produced by running the released code with a fixed seed, and that I take full responsibility for the content.</w:t>
+        <w:rPr>
+          <w:b/>
+        </w:rPr>
+        <w:t>Data, code and AI use.</w:t>
+      </w:r>
+      <w:r>
+        <w:t xml:space="preserve"> Code, tests, configurations, results and figure scripts are public at https://github.com/sandlerleon/subsurface-risk-calibrated-mapping (release v1.2.0) and archived at https://doi.org/10.5281/zenodo.23308158; the preprint is at https://doi.org/10.5281/zenodo.23308159. A fresh clone of the release reproduces the results files (Appendix B). The manuscript declares, in line with the publisher’s policy, that Claude (Anthropic; Claude Sonnet 5.5, through Claude Code) was used to help write and run the code, generate figures and draft and edit the text, that the simulation outputs were produced by running the released code with a fixed seed, and that I take full responsibility for the content.</w:t>
       </w:r>
     </w:p>
     <w:p>

</xml_diff>